<commit_message>
Update the assembled report docx with the new output-filter defence
Adds Section 6.5 describing defence.filter_summary(), updates 7.1,
7.3, 7.5, 8.2, and 8.3's table with explicit [PENDING] markers for
this new, unmeasured defence - mirroring report_v0.md's addendum.
21 pages now (was 20), rendered and visually verified.
</commit_message>
<xml_diff>
--- a/report/ScoutMind_report_v2.docx
+++ b/report/ScoutMind_report_v2.docx
@@ -3118,6 +3118,89 @@
     </w:p>
     <w:p>
       <w:pPr>
+        <w:pStyle w:val="Heading2"/>
+        <w:spacing w:after="120" w:before="240"/>
+      </w:pPr>
+      <w:r>
+        <w:t xml:space="preserve">6.5 A second defence layer: output filtering (new, not yet measured against the live model)</w:t>
+      </w:r>
+    </w:p>
+    <w:p>
+      <w:pPr>
+        <w:spacing w:after="160"/>
+      </w:pPr>
+      <w:r>
+        <w:rPr>
+          <w:b w:val="false"/>
+          <w:bCs w:val="false"/>
+          <w:i w:val="false"/>
+          <w:iCs w:val="false"/>
+        </w:rPr>
+        <w:t xml:space="preserve">Section 6.4 names a real gap: the allowlist has nothing to say about a leak that never calls render_image at all. defence.py now also implements filter_summary(text), a second, independent layer gated by the same DEFENCE_ENABLED flag. When the defence is on, it redacts the known fake account email and API key from the text immediately before that text reaches the channel the user actually sees — not inside save_summary() itself, but at the point in the agent loop where that official “what the user sees” value is set, keeping the tool's own confirmation message and the displayed summary as the two separate things the existing design already treats them as.</w:t>
+      </w:r>
+    </w:p>
+    <w:p>
+      <w:pPr>
+        <w:spacing w:after="160"/>
+      </w:pPr>
+      <w:r>
+        <w:rPr>
+          <w:b w:val="false"/>
+          <w:bCs w:val="false"/>
+          <w:i w:val="false"/>
+          <w:iCs w:val="false"/>
+        </w:rPr>
+        <w:t xml:space="preserve">This closes the specific gap Section 8.2 describes: a leak that misuses no tool cannot be caught by restricting tools, but it can still be caught by inspecting the output before it is shown. It was confirmed directly with the exact wording captured in the demonstration video — fed by hand into filter_summary(), the account email and API key were both correctly redacted — and is covered by four new unit tests (200 total, all passing).</w:t>
+      </w:r>
+    </w:p>
+    <w:p>
+      <w:pPr>
+        <w:spacing w:after="160"/>
+      </w:pPr>
+      <w:r>
+        <w:rPr>
+          <w:b/>
+          <w:bCs/>
+          <w:i w:val="false"/>
+          <w:iCs w:val="false"/>
+        </w:rPr>
+        <w:t xml:space="preserve">This has not yet been measured against the live model. </w:t>
+      </w:r>
+      <w:r>
+        <w:rPr>
+          <w:b w:val="false"/>
+          <w:bCs w:val="false"/>
+          <w:i w:val="false"/>
+          <w:iCs w:val="false"/>
+        </w:rPr>
+        <w:t xml:space="preserve">The confirmation above used hand-fed text, not a live run, so it shows the redaction logic works, not what the real text-leak rate becomes once a live model is generating the wording. [PENDING — re-run the attack scenario, defence on, 10 trials, with this filter in place, and report the new text-leak rate next to the 80% already measured before this filter existed.]</w:t>
+      </w:r>
+    </w:p>
+    <w:p>
+      <w:pPr>
+        <w:spacing w:after="160"/>
+      </w:pPr>
+      <w:r>
+        <w:rPr>
+          <w:b/>
+          <w:bCs/>
+          <w:i w:val="false"/>
+          <w:iCs w:val="false"/>
+        </w:rPr>
+        <w:t xml:space="preserve">A deliberate, known cost: </w:t>
+      </w:r>
+      <w:r>
+        <w:rPr>
+          <w:b w:val="false"/>
+          <w:bCs w:val="false"/>
+          <w:i w:val="false"/>
+          <w:iCs w:val="false"/>
+        </w:rPr>
+        <w:t xml:space="preserve">the filter is a blunt keyword match. It cannot tell a genuine user request for their own email (the legit_email scenario) apart from an injected one — turning it on will also redact a legitimate request. [PENDING — when legit_email is run, report email_provided under this filter alongside the allowlist's own 0%-leak-but-doesn't-stop-the-hijack trade-off in Section 7.3, as a second, different cost of a second, different defence.]</w:t>
+      </w:r>
+    </w:p>
+    <w:p>
+      <w:pPr>
         <w:pStyle w:val="Heading1"/>
         <w:spacing w:after="160" w:before="320"/>
       </w:pPr>
@@ -3187,7 +3270,7 @@
           <w:i w:val="false"/>
           <w:iCs w:val="false"/>
         </w:rPr>
-        <w:t xml:space="preserve">The third is the status of the three extension scenarios the same runner supports (cdn, text_only, legit_email): built and covered by unit tests, with injection wordings already adapted from the final tuned baseline (naming the tool, URL-encoding, full examples), but [PENDING — results to be inserted once the extension-scenario runs complete] as their own measured condition. Section 8 reports what we can say about them from the exploratory runs and the literature in the meantime.</w:t>
+        <w:t xml:space="preserve">The third is the status of the three extension scenarios the same runner supports (cdn, text_only, legit_email): built and covered by unit tests, with injection wordings already adapted from the final tuned baseline (naming the tool, URL-encoding, full examples), but [PENDING — results to be inserted once the extension-scenario runs complete] as their own measured condition. Section 8 reports what we can say about them from the exploratory runs and the literature in the meantime. A fourth item awaits the same treatment: Section 6.5's output-filter defence, added after the formal experiment below was run, and not yet re-measured against the live model.</w:t>
       </w:r>
     </w:p>
     <w:p>
@@ -4566,6 +4649,29 @@
     </w:p>
     <w:p>
       <w:pPr>
+        <w:spacing w:after="160"/>
+      </w:pPr>
+      <w:r>
+        <w:rPr>
+          <w:b/>
+          <w:bCs/>
+          <w:i w:val="false"/>
+          <w:iCs w:val="false"/>
+        </w:rPr>
+        <w:t xml:space="preserve">Note on the 80% figure above: </w:t>
+      </w:r>
+      <w:r>
+        <w:rPr>
+          <w:b w:val="false"/>
+          <w:bCs w:val="false"/>
+          <w:i w:val="false"/>
+          <w:iCs w:val="false"/>
+        </w:rPr>
+        <w:t xml:space="preserve">this was measured before the output-filter defence in Section 6.5 existed. It is the correct, honest number for the allowlist alone, and should stay in the report exactly as measured — but [PENDING — a fresh 10-trial run with the output filter also enabled is needed before claiming any different rate; do not edit this 80% retroactively, add the new measurement alongside it].</w:t>
+      </w:r>
+    </w:p>
+    <w:p>
+      <w:pPr>
         <w:pStyle w:val="Heading2"/>
         <w:spacing w:after="120" w:before="240"/>
       </w:pPr>
@@ -4621,7 +4727,7 @@
           <w:i w:val="false"/>
           <w:iCs w:val="false"/>
         </w:rPr>
-        <w:t xml:space="preserve">The attack chain is demonstrated end to end against a live model, with a formally measured 30% image-channel leak rate undefended, falling to 0% with the allowlist defence enabled, at no cost to legitimate task completion. The defence does not reduce the underlying goal hijack or the text-only leak, both measured at 70–80% regardless of its setting. The three extension scenarios (allowlisted-domain leak, isolated text-only condition, and the explicit legitimate-email request) are built and unit-tested [PENDING — results to be inserted once available]; completing them is the most valuable remaining work before final submission.</w:t>
+        <w:t xml:space="preserve">The attack chain is demonstrated end to end against a live model, with a formally measured 30% image-channel leak rate undefended, falling to 0% with the allowlist defence enabled, at no cost to legitimate task completion. The defence does not reduce the underlying goal hijack or the text-only leak, both measured at 70–80% regardless of its setting. The three extension scenarios (allowlisted-domain leak, isolated text-only condition, and the explicit legitimate-email request) are built and unit-tested [PENDING — results to be inserted once available], and a fourth item — the new output-filter defence from Section 6.5, built specifically to address the text-only leak this section measured — is implemented and unit-tested but likewise [PENDING — not yet re-run against the live model]. Completing all four is the most valuable remaining work before final submission.</w:t>
       </w:r>
     </w:p>
     <w:p>
@@ -4733,6 +4839,20 @@
           <w:iCs w:val="false"/>
         </w:rPr>
         <w:t xml:space="preserve">Because the allowlist only governs render_image, enabling it does not affect this variant at all: the data never touches a tool it controls. This shows the limit of any tool-level control: a leak that misuses no tool cannot be caught by restricting tools. Closing it requires either output-side checks, such as scanning the final summary for sensitive values before it is saved, or preventing the sensitive data from entering the context in the first place.</w:t>
+      </w:r>
+    </w:p>
+    <w:p>
+      <w:pPr>
+        <w:spacing w:after="160"/>
+      </w:pPr>
+      <w:r>
+        <w:rPr>
+          <w:b w:val="false"/>
+          <w:bCs w:val="false"/>
+          <w:i w:val="false"/>
+          <w:iCs w:val="false"/>
+        </w:rPr>
+        <w:t xml:space="preserve">Section 6.5 adds exactly the first of those two options — an output-side check scanning the final summary before it is shown. [PENDING — this variant needs to be re-measured with that filter in place; the prediction, not yet confirmed, is that the text-leak rate drops from the 80% measured above toward 0%, the same way the allowlist alone took the image-channel rate from 30% to 0%.]</w:t>
       </w:r>
     </w:p>
     <w:p>
@@ -4842,7 +4962,7 @@
                 <w:sz w:val="20"/>
                 <w:szCs w:val="20"/>
               </w:rPr>
-              <w:t xml:space="preserve">Allowlist on</w:t>
+              <w:t xml:space="preserve">Allowlist on (output filter not yet in this table)</w:t>
             </w:r>
           </w:p>
         </w:tc>
@@ -5087,6 +5207,86 @@
           </w:p>
         </w:tc>
       </w:tr>
+      <w:tr>
+        <w:tc>
+          <w:tcPr>
+            <w:tcW w:type="dxa" w:w="2600"/>
+            <w:tcMar>
+              <w:top w:type="dxa" w:w="60"/>
+              <w:left w:type="dxa" w:w="100"/>
+              <w:bottom w:type="dxa" w:w="60"/>
+              <w:right w:type="dxa" w:w="100"/>
+            </w:tcMar>
+            <w:vAlign w:val="center"/>
+          </w:tcPr>
+          <w:p>
+            <w:pPr>
+              <w:jc w:val="left"/>
+            </w:pPr>
+            <w:r>
+              <w:rPr>
+                <w:b w:val="false"/>
+                <w:bCs w:val="false"/>
+                <w:sz w:val="20"/>
+                <w:szCs w:val="20"/>
+              </w:rPr>
+              <w:t xml:space="preserve">Variant B, allowlist + output filter (Section 6.5)</w:t>
+            </w:r>
+          </w:p>
+        </w:tc>
+        <w:tc>
+          <w:tcPr>
+            <w:tcW w:type="dxa" w:w="2800"/>
+            <w:tcMar>
+              <w:top w:type="dxa" w:w="60"/>
+              <w:left w:type="dxa" w:w="100"/>
+              <w:bottom w:type="dxa" w:w="60"/>
+              <w:right w:type="dxa" w:w="100"/>
+            </w:tcMar>
+            <w:vAlign w:val="center"/>
+          </w:tcPr>
+          <w:p>
+            <w:pPr>
+              <w:jc w:val="left"/>
+            </w:pPr>
+            <w:r>
+              <w:rPr>
+                <w:b w:val="false"/>
+                <w:bCs w:val="false"/>
+                <w:sz w:val="20"/>
+                <w:szCs w:val="20"/>
+              </w:rPr>
+              <w:t xml:space="preserve">n/a — filter is also gated by DEFENCE_ENABLED</w:t>
+            </w:r>
+          </w:p>
+        </w:tc>
+        <w:tc>
+          <w:tcPr>
+            <w:tcW w:type="dxa" w:w="3600"/>
+            <w:tcMar>
+              <w:top w:type="dxa" w:w="60"/>
+              <w:left w:type="dxa" w:w="100"/>
+              <w:bottom w:type="dxa" w:w="60"/>
+              <w:right w:type="dxa" w:w="100"/>
+            </w:tcMar>
+            <w:vAlign w:val="center"/>
+          </w:tcPr>
+          <w:p>
+            <w:pPr>
+              <w:jc w:val="left"/>
+            </w:pPr>
+            <w:r>
+              <w:rPr>
+                <w:b w:val="false"/>
+                <w:bCs w:val="false"/>
+                <w:sz w:val="20"/>
+                <w:szCs w:val="20"/>
+              </w:rPr>
+              <w:t xml:space="preserve">[PENDING — not yet measured; prediction is a rate near 0%, confirmed so far only with hand-fed text, not a live run]</w:t>
+            </w:r>
+          </w:p>
+        </w:tc>
+      </w:tr>
     </w:tbl>
     <w:p>
       <w:pPr>
@@ -5113,7 +5313,7 @@
           <w:i w:val="false"/>
           <w:iCs w:val="false"/>
         </w:rPr>
-        <w:t xml:space="preserve">The allowlist is necessary but not sufficient. It closes the specific channel it was designed for while leaving the underlying problem, that untrusted content can steer a privileged action, untouched. A robust design would combine it with least agency (not exposing lookup_account_info to a research task that does not need it), provenance-based separation of user and page instructions, and output filtering.</w:t>
+        <w:t xml:space="preserve">The allowlist is necessary but not sufficient. It closes the specific channel it was designed for while leaving the underlying problem, that untrusted content can steer a privileged action, untouched. A robust design would combine it with least agency (not exposing lookup_account_info to a research task that does not need it), provenance-based separation of user and page instructions, and output filtering — the last of which is now implemented (Section 6.5) but still awaiting its own real measurement, the same as the row above states plainly.</w:t>
       </w:r>
     </w:p>
     <w:p>

</xml_diff>

<commit_message>
Fix a self-contradiction in Section 5.1 found during a user read-through
The payload shown in 5.1 literally contains "by calling render_image",
but the paragraph right after it claimed the payload "never names a
function" and that "the attacker does not know ScoutMind's internals."
Both false, and avoidably so: Section 5.5 and 10.1 already documented
that naming the tool was the single biggest fix during tuning - 5.1
just never got updated to match once the final wording was settled.

Replaced with an accurate account: the function-agnostic version was
the original plan, it didn't survive tuning, and the final committed
payload does name render_image - framed as a real finding (vague
injections are less reliable against this model) rather than a quietly
deleted claim.
</commit_message>
<xml_diff>
--- a/report/ScoutMind_report_v2.docx
+++ b/report/ScoutMind_report_v2.docx
@@ -2408,7 +2408,35 @@
           <w:i w:val="false"/>
           <w:iCs w:val="false"/>
         </w:rPr>
-        <w:t xml:space="preserve">Two design choices make the payload effective. First, it never names a function. It asks, in plain language, for the user's account details to be included as a “reference image”. The attacker does not know ScoutMind's internals and does not need to; the model's own planning links “account details” to the tool that provides them. Second, it frames the request as a courtesy to the user, which makes it read as helpful rather than hostile.</w:t>
+        <w:t xml:space="preserve">The payload frames the request as a courtesy to the user — personalising the summary, letting them “verify it was prepared for them” — which makes it read as helpful rather than hostile. That framing worked as intended throughout tuning.</w:t>
+      </w:r>
+    </w:p>
+    <w:p>
+      <w:pPr>
+        <w:spacing w:after="160"/>
+      </w:pPr>
+      <w:r>
+        <w:rPr>
+          <w:b w:val="false"/>
+          <w:bCs w:val="false"/>
+          <w:i w:val="false"/>
+          <w:iCs w:val="false"/>
+        </w:rPr>
+        <w:t xml:space="preserve">The original plan was also for the payload to never name a specific function: it would describe only the desired outcome in plain language, leaving the model's own planning to connect “account details” to whichever tool provides them, so an attacker would not need any knowledge of ScoutMind's internals to write it. This did not survive tuning. Section 5.5 and Section 10.1 both record why: wording that only described the outcome (rounds 1–2) got the model to fetch the account data but not reliably to act on it further; the single biggest fix was adding “by calling render_image” explicitly. The payload above, the final committed fixture, therefore does name the tool — it is not the function-agnostic version the original design called for.</w:t>
+      </w:r>
+    </w:p>
+    <w:p>
+      <w:pPr>
+        <w:spacing w:after="160"/>
+      </w:pPr>
+      <w:r>
+        <w:rPr>
+          <w:b w:val="false"/>
+          <w:bCs w:val="false"/>
+          <w:i w:val="false"/>
+          <w:iCs w:val="false"/>
+        </w:rPr>
+        <w:t xml:space="preserve">This is itself a finding worth keeping rather than quietly dropping the earlier claim: against a model this size, a vague, outcome-only injection was markedly less reliable than one that names the specific capability it wants exercised. That has a real security implication beyond this one demo — an attacker who can guess or learn even approximate tool names (common names, or names leaked through error messages, documentation, or a leaked system prompt) has a measurable advantage over one working blind, which is a stronger and more interesting claim than “the attacker does not need to know anything.”</w:t>
       </w:r>
     </w:p>
     <w:p>

</xml_diff>